<commit_message>
feat(console): Documents in three sections with a filtered editor list; meetings by level
The Documents index shows three squares (NGO registration and legal
templates, organisation and rules, published policies) and, under them, only
the chosen section; the pack editor lists only the open document's section
and its back link returns to that section. The organisation document gains
Article 14, who attends which meeting and who receives updates, adopted as a
proposal at the founders' meeting of 20 October 2026.

Co-Authored-By: Claude Fable 5.1 <noreply@anthropic.com>
Claude-Session: https://claude.ai/code/session_01AVM926ubKsaqkthGFjJRy4
</commit_message>
<xml_diff>
--- a/docs/legal/dist/organisation-and-roles.docx
+++ b/docs/legal/dist/organisation-and-roles.docx
@@ -8146,7 +8146,7 @@
                 <w:sz w:val="20"/>
                 <w:szCs w:val="20"/>
               </w:rPr>
-              <w:t xml:space="preserve">Član 14 — Kako se preuzima uloga</w:t>
+              <w:t xml:space="preserve">Član 14 — Sastanci i obavještenja po nivoima</w:t>
             </w:r>
           </w:p>
         </w:tc>
@@ -8171,7 +8171,1395 @@
                 <w:sz w:val="20"/>
                 <w:szCs w:val="20"/>
               </w:rPr>
-              <w:t xml:space="preserve">Article 14 — How a role is taken up</w:t>
+              <w:t xml:space="preserve">Article 14 — Meetings and updates by level</w:t>
+            </w:r>
+          </w:p>
+        </w:tc>
+      </w:tr>
+      <w:tr>
+        <w:tc>
+          <w:tcPr>
+            <w:tcW w:type="dxa" w:w="4953"/>
+            <w:tcMar>
+              <w:top w:type="dxa" w:w="80"/>
+              <w:left w:type="dxa" w:w="100"/>
+              <w:bottom w:type="dxa" w:w="80"/>
+              <w:right w:type="dxa" w:w="100"/>
+            </w:tcMar>
+          </w:tcPr>
+          <w:p>
+            <w:pPr>
+              <w:spacing w:after="100"/>
+            </w:pPr>
+            <w:r>
+              <w:rPr>
+                <w:rFonts w:ascii="Arial" w:cs="Arial" w:eastAsia="Arial" w:hAnsi="Arial"/>
+                <w:sz w:val="18"/>
+                <w:szCs w:val="18"/>
+              </w:rPr>
+              <w:t xml:space="preserve">Ne sjedi svaki nivo na svakom sastanku. Tabela kaže ko prisustvuje kom sastanku, a ko samo dobija obavještenje, tako da niko nije pozvan na sve i niko nije izostavljen iz onoga što ga se tiče.</w:t>
+            </w:r>
+          </w:p>
+        </w:tc>
+        <w:tc>
+          <w:tcPr>
+            <w:tcW w:type="dxa" w:w="4953"/>
+            <w:tcMar>
+              <w:top w:type="dxa" w:w="80"/>
+              <w:left w:type="dxa" w:w="100"/>
+              <w:bottom w:type="dxa" w:w="80"/>
+              <w:right w:type="dxa" w:w="100"/>
+            </w:tcMar>
+          </w:tcPr>
+          <w:p>
+            <w:pPr>
+              <w:spacing w:after="100"/>
+            </w:pPr>
+            <w:r>
+              <w:rPr>
+                <w:rFonts w:ascii="Arial" w:cs="Arial" w:eastAsia="Arial" w:hAnsi="Arial"/>
+                <w:sz w:val="18"/>
+                <w:szCs w:val="18"/>
+              </w:rPr>
+              <w:t xml:space="preserve">Not every level sits in every meeting. The table says who attends which meeting and who only receives updates, so nobody is invited to everything and nobody is left out of what concerns them.</w:t>
+            </w:r>
+          </w:p>
+        </w:tc>
+      </w:tr>
+      <w:tr>
+        <w:tc>
+          <w:tcPr>
+            <w:tcW w:type="dxa" w:w="4953"/>
+            <w:tcMar>
+              <w:top w:type="dxa" w:w="80"/>
+              <w:left w:type="dxa" w:w="100"/>
+              <w:bottom w:type="dxa" w:w="80"/>
+              <w:right w:type="dxa" w:w="100"/>
+            </w:tcMar>
+          </w:tcPr>
+          <w:tbl>
+            <w:tblPr>
+              <w:tblW w:type="dxa" w:w="4753"/>
+              <w:tblBorders>
+                <w:top w:val="single" w:color="C9D3D7" w:sz="4"/>
+                <w:left w:val="single" w:color="C9D3D7" w:sz="4"/>
+                <w:bottom w:val="single" w:color="C9D3D7" w:sz="4"/>
+                <w:right w:val="single" w:color="C9D3D7" w:sz="4"/>
+                <w:insideH w:val="single" w:color="C9D3D7" w:sz="4"/>
+                <w:insideV w:val="single" w:color="C9D3D7" w:sz="4"/>
+              </w:tblBorders>
+            </w:tblPr>
+            <w:tblGrid>
+              <w:gridCol w:w="1188"/>
+              <w:gridCol w:w="1188"/>
+              <w:gridCol w:w="1188"/>
+              <w:gridCol w:w="1188"/>
+            </w:tblGrid>
+            <w:tr>
+              <w:trPr>
+                <w:tblHeader/>
+              </w:trPr>
+              <w:tc>
+                <w:tcPr>
+                  <w:tcW w:type="dxa" w:w="1188"/>
+                  <w:shd w:fill="E3EBED" w:color="auto" w:val="clear"/>
+                  <w:tcMar>
+                    <w:top w:type="dxa" w:w="40"/>
+                    <w:left w:type="dxa" w:w="60"/>
+                    <w:bottom w:type="dxa" w:w="40"/>
+                    <w:right w:type="dxa" w:w="60"/>
+                  </w:tcMar>
+                </w:tcPr>
+                <w:p>
+                  <w:r>
+                    <w:rPr>
+                      <w:rFonts w:ascii="Arial" w:cs="Arial" w:eastAsia="Arial" w:hAnsi="Arial"/>
+                      <w:b/>
+                      <w:bCs/>
+                      <w:sz w:val="16"/>
+                      <w:szCs w:val="16"/>
+                    </w:rPr>
+                    <w:t xml:space="preserve">Sastanak ili obavještenje</w:t>
+                  </w:r>
+                </w:p>
+              </w:tc>
+              <w:tc>
+                <w:tcPr>
+                  <w:tcW w:type="dxa" w:w="1188"/>
+                  <w:shd w:fill="E3EBED" w:color="auto" w:val="clear"/>
+                  <w:tcMar>
+                    <w:top w:type="dxa" w:w="40"/>
+                    <w:left w:type="dxa" w:w="60"/>
+                    <w:bottom w:type="dxa" w:w="40"/>
+                    <w:right w:type="dxa" w:w="60"/>
+                  </w:tcMar>
+                </w:tcPr>
+                <w:p>
+                  <w:r>
+                    <w:rPr>
+                      <w:rFonts w:ascii="Arial" w:cs="Arial" w:eastAsia="Arial" w:hAnsi="Arial"/>
+                      <w:b/>
+                      <w:bCs/>
+                      <w:sz w:val="16"/>
+                      <w:szCs w:val="16"/>
+                    </w:rPr>
+                    <w:t xml:space="preserve">Prisustvuje i odlučuje</w:t>
+                  </w:r>
+                </w:p>
+              </w:tc>
+              <w:tc>
+                <w:tcPr>
+                  <w:tcW w:type="dxa" w:w="1188"/>
+                  <w:shd w:fill="E3EBED" w:color="auto" w:val="clear"/>
+                  <w:tcMar>
+                    <w:top w:type="dxa" w:w="40"/>
+                    <w:left w:type="dxa" w:w="60"/>
+                    <w:bottom w:type="dxa" w:w="40"/>
+                    <w:right w:type="dxa" w:w="60"/>
+                  </w:tcMar>
+                </w:tcPr>
+                <w:p>
+                  <w:r>
+                    <w:rPr>
+                      <w:rFonts w:ascii="Arial" w:cs="Arial" w:eastAsia="Arial" w:hAnsi="Arial"/>
+                      <w:b/>
+                      <w:bCs/>
+                      <w:sz w:val="16"/>
+                      <w:szCs w:val="16"/>
+                    </w:rPr>
+                    <w:t xml:space="preserve">Prisustvuje bez prava glasa</w:t>
+                  </w:r>
+                </w:p>
+              </w:tc>
+              <w:tc>
+                <w:tcPr>
+                  <w:tcW w:type="dxa" w:w="1188"/>
+                  <w:shd w:fill="E3EBED" w:color="auto" w:val="clear"/>
+                  <w:tcMar>
+                    <w:top w:type="dxa" w:w="40"/>
+                    <w:left w:type="dxa" w:w="60"/>
+                    <w:bottom w:type="dxa" w:w="40"/>
+                    <w:right w:type="dxa" w:w="60"/>
+                  </w:tcMar>
+                </w:tcPr>
+                <w:p>
+                  <w:r>
+                    <w:rPr>
+                      <w:rFonts w:ascii="Arial" w:cs="Arial" w:eastAsia="Arial" w:hAnsi="Arial"/>
+                      <w:b/>
+                      <w:bCs/>
+                      <w:sz w:val="16"/>
+                      <w:szCs w:val="16"/>
+                    </w:rPr>
+                    <w:t xml:space="preserve">Samo dobija obavještenje</w:t>
+                  </w:r>
+                </w:p>
+              </w:tc>
+            </w:tr>
+            <w:tr>
+              <w:trPr>
+                <w:tblHeader w:val="off"/>
+              </w:trPr>
+              <w:tc>
+                <w:tcPr>
+                  <w:tcW w:type="dxa" w:w="1188"/>
+                  <w:tcMar>
+                    <w:top w:type="dxa" w:w="40"/>
+                    <w:left w:type="dxa" w:w="60"/>
+                    <w:bottom w:type="dxa" w:w="40"/>
+                    <w:right w:type="dxa" w:w="60"/>
+                  </w:tcMar>
+                </w:tcPr>
+                <w:p>
+                  <w:r>
+                    <w:rPr>
+                      <w:rFonts w:ascii="Arial" w:cs="Arial" w:eastAsia="Arial" w:hAnsi="Arial"/>
+                      <w:b w:val="false"/>
+                      <w:bCs w:val="false"/>
+                      <w:sz w:val="16"/>
+                      <w:szCs w:val="16"/>
+                    </w:rPr>
+                    <w:t xml:space="preserve">Skupština, najmanje jednom godišnje</w:t>
+                  </w:r>
+                </w:p>
+              </w:tc>
+              <w:tc>
+                <w:tcPr>
+                  <w:tcW w:type="dxa" w:w="1188"/>
+                  <w:tcMar>
+                    <w:top w:type="dxa" w:w="40"/>
+                    <w:left w:type="dxa" w:w="60"/>
+                    <w:bottom w:type="dxa" w:w="40"/>
+                    <w:right w:type="dxa" w:w="60"/>
+                  </w:tcMar>
+                </w:tcPr>
+                <w:p>
+                  <w:r>
+                    <w:rPr>
+                      <w:rFonts w:ascii="Arial" w:cs="Arial" w:eastAsia="Arial" w:hAnsi="Arial"/>
+                      <w:b w:val="false"/>
+                      <w:bCs w:val="false"/>
+                      <w:sz w:val="16"/>
+                      <w:szCs w:val="16"/>
+                    </w:rPr>
+                    <w:t xml:space="preserve">Svaki član, uključujući osnivače, lično ili preko punomoćnika</w:t>
+                  </w:r>
+                </w:p>
+              </w:tc>
+              <w:tc>
+                <w:tcPr>
+                  <w:tcW w:type="dxa" w:w="1188"/>
+                  <w:tcMar>
+                    <w:top w:type="dxa" w:w="40"/>
+                    <w:left w:type="dxa" w:w="60"/>
+                    <w:bottom w:type="dxa" w:w="40"/>
+                    <w:right w:type="dxa" w:w="60"/>
+                  </w:tcMar>
+                </w:tcPr>
+                <w:p>
+                  <w:r>
+                    <w:rPr>
+                      <w:rFonts w:ascii="Arial" w:cs="Arial" w:eastAsia="Arial" w:hAnsi="Arial"/>
+                      <w:b w:val="false"/>
+                      <w:bCs w:val="false"/>
+                      <w:sz w:val="16"/>
+                      <w:szCs w:val="16"/>
+                    </w:rPr>
+                    <w:t xml:space="preserve">Volonteri koji nijesu članovi, pozvani gosti</w:t>
+                  </w:r>
+                </w:p>
+              </w:tc>
+              <w:tc>
+                <w:tcPr>
+                  <w:tcW w:type="dxa" w:w="1188"/>
+                  <w:tcMar>
+                    <w:top w:type="dxa" w:w="40"/>
+                    <w:left w:type="dxa" w:w="60"/>
+                    <w:bottom w:type="dxa" w:w="40"/>
+                    <w:right w:type="dxa" w:w="60"/>
+                  </w:tcMar>
+                </w:tcPr>
+                <w:p>
+                  <w:r>
+                    <w:rPr>
+                      <w:rFonts w:ascii="Arial" w:cs="Arial" w:eastAsia="Arial" w:hAnsi="Arial"/>
+                      <w:b w:val="false"/>
+                      <w:bCs w:val="false"/>
+                      <w:sz w:val="16"/>
+                      <w:szCs w:val="16"/>
+                    </w:rPr>
+                    <w:t xml:space="preserve">Donatori, sponzori i partneri dobijaju godišnji izvještaj i poziv na Dan uticaja</w:t>
+                  </w:r>
+                </w:p>
+              </w:tc>
+            </w:tr>
+            <w:tr>
+              <w:trPr>
+                <w:tblHeader w:val="off"/>
+              </w:trPr>
+              <w:tc>
+                <w:tcPr>
+                  <w:tcW w:type="dxa" w:w="1188"/>
+                  <w:tcMar>
+                    <w:top w:type="dxa" w:w="40"/>
+                    <w:left w:type="dxa" w:w="60"/>
+                    <w:bottom w:type="dxa" w:w="40"/>
+                    <w:right w:type="dxa" w:w="60"/>
+                  </w:tcMar>
+                </w:tcPr>
+                <w:p>
+                  <w:r>
+                    <w:rPr>
+                      <w:rFonts w:ascii="Arial" w:cs="Arial" w:eastAsia="Arial" w:hAnsi="Arial"/>
+                      <w:b w:val="false"/>
+                      <w:bCs w:val="false"/>
+                      <w:sz w:val="16"/>
+                      <w:szCs w:val="16"/>
+                    </w:rPr>
+                    <w:t xml:space="preserve">Upravni odbor, četiri sjednice godišnje</w:t>
+                  </w:r>
+                </w:p>
+              </w:tc>
+              <w:tc>
+                <w:tcPr>
+                  <w:tcW w:type="dxa" w:w="1188"/>
+                  <w:tcMar>
+                    <w:top w:type="dxa" w:w="40"/>
+                    <w:left w:type="dxa" w:w="60"/>
+                    <w:bottom w:type="dxa" w:w="40"/>
+                    <w:right w:type="dxa" w:w="60"/>
+                  </w:tcMar>
+                </w:tcPr>
+                <w:p>
+                  <w:r>
+                    <w:rPr>
+                      <w:rFonts w:ascii="Arial" w:cs="Arial" w:eastAsia="Arial" w:hAnsi="Arial"/>
+                      <w:b w:val="false"/>
+                      <w:bCs w:val="false"/>
+                      <w:sz w:val="16"/>
+                      <w:szCs w:val="16"/>
+                    </w:rPr>
+                    <w:t xml:space="preserve">Članovi Upravnog odbora</w:t>
+                  </w:r>
+                </w:p>
+              </w:tc>
+              <w:tc>
+                <w:tcPr>
+                  <w:tcW w:type="dxa" w:w="1188"/>
+                  <w:tcMar>
+                    <w:top w:type="dxa" w:w="40"/>
+                    <w:left w:type="dxa" w:w="60"/>
+                    <w:bottom w:type="dxa" w:w="40"/>
+                    <w:right w:type="dxa" w:w="60"/>
+                  </w:tcMar>
+                </w:tcPr>
+                <w:p>
+                  <w:r>
+                    <w:rPr>
+                      <w:rFonts w:ascii="Arial" w:cs="Arial" w:eastAsia="Arial" w:hAnsi="Arial"/>
+                      <w:b w:val="false"/>
+                      <w:bCs w:val="false"/>
+                      <w:sz w:val="16"/>
+                      <w:szCs w:val="16"/>
+                    </w:rPr>
+                    <w:t xml:space="preserve">Izvršni direktor; rukovodilac tima ili ogranka za svoju tačku, po pozivu</w:t>
+                  </w:r>
+                </w:p>
+              </w:tc>
+              <w:tc>
+                <w:tcPr>
+                  <w:tcW w:type="dxa" w:w="1188"/>
+                  <w:tcMar>
+                    <w:top w:type="dxa" w:w="40"/>
+                    <w:left w:type="dxa" w:w="60"/>
+                    <w:bottom w:type="dxa" w:w="40"/>
+                    <w:right w:type="dxa" w:w="60"/>
+                  </w:tcMar>
+                </w:tcPr>
+                <w:p>
+                  <w:r>
+                    <w:rPr>
+                      <w:rFonts w:ascii="Arial" w:cs="Arial" w:eastAsia="Arial" w:hAnsi="Arial"/>
+                      <w:b w:val="false"/>
+                      <w:bCs w:val="false"/>
+                      <w:sz w:val="16"/>
+                      <w:szCs w:val="16"/>
+                    </w:rPr>
+                    <w:t xml:space="preserve">Svaki član: kratka bilješka o odlukama poslije svake sjednice</w:t>
+                  </w:r>
+                </w:p>
+              </w:tc>
+            </w:tr>
+            <w:tr>
+              <w:trPr>
+                <w:tblHeader w:val="off"/>
+              </w:trPr>
+              <w:tc>
+                <w:tcPr>
+                  <w:tcW w:type="dxa" w:w="1188"/>
+                  <w:tcMar>
+                    <w:top w:type="dxa" w:w="40"/>
+                    <w:left w:type="dxa" w:w="60"/>
+                    <w:bottom w:type="dxa" w:w="40"/>
+                    <w:right w:type="dxa" w:w="60"/>
+                  </w:tcMar>
+                </w:tcPr>
+                <w:p>
+                  <w:r>
+                    <w:rPr>
+                      <w:rFonts w:ascii="Arial" w:cs="Arial" w:eastAsia="Arial" w:hAnsi="Arial"/>
+                      <w:b w:val="false"/>
+                      <w:bCs w:val="false"/>
+                      <w:sz w:val="16"/>
+                      <w:szCs w:val="16"/>
+                    </w:rPr>
+                    <w:t xml:space="preserve">Komisija za dodjelu sredstava, četiri sjednice godišnje</w:t>
+                  </w:r>
+                </w:p>
+              </w:tc>
+              <w:tc>
+                <w:tcPr>
+                  <w:tcW w:type="dxa" w:w="1188"/>
+                  <w:tcMar>
+                    <w:top w:type="dxa" w:w="40"/>
+                    <w:left w:type="dxa" w:w="60"/>
+                    <w:bottom w:type="dxa" w:w="40"/>
+                    <w:right w:type="dxa" w:w="60"/>
+                  </w:tcMar>
+                </w:tcPr>
+                <w:p>
+                  <w:r>
+                    <w:rPr>
+                      <w:rFonts w:ascii="Arial" w:cs="Arial" w:eastAsia="Arial" w:hAnsi="Arial"/>
+                      <w:b w:val="false"/>
+                      <w:bCs w:val="false"/>
+                      <w:sz w:val="16"/>
+                      <w:szCs w:val="16"/>
+                    </w:rPr>
+                    <w:t xml:space="preserve">Članovi Komisije</w:t>
+                  </w:r>
+                </w:p>
+              </w:tc>
+              <w:tc>
+                <w:tcPr>
+                  <w:tcW w:type="dxa" w:w="1188"/>
+                  <w:tcMar>
+                    <w:top w:type="dxa" w:w="40"/>
+                    <w:left w:type="dxa" w:w="60"/>
+                    <w:bottom w:type="dxa" w:w="40"/>
+                    <w:right w:type="dxa" w:w="60"/>
+                  </w:tcMar>
+                </w:tcPr>
+                <w:p>
+                  <w:r>
+                    <w:rPr>
+                      <w:rFonts w:ascii="Arial" w:cs="Arial" w:eastAsia="Arial" w:hAnsi="Arial"/>
+                      <w:b w:val="false"/>
+                      <w:bCs w:val="false"/>
+                      <w:sz w:val="16"/>
+                      <w:szCs w:val="16"/>
+                    </w:rPr>
+                    <w:t xml:space="preserve">Izvršni direktor radi zapisnika i sprovođenja; podnosilac prijave kada se saslušava</w:t>
+                  </w:r>
+                </w:p>
+              </w:tc>
+              <w:tc>
+                <w:tcPr>
+                  <w:tcW w:type="dxa" w:w="1188"/>
+                  <w:tcMar>
+                    <w:top w:type="dxa" w:w="40"/>
+                    <w:left w:type="dxa" w:w="60"/>
+                    <w:bottom w:type="dxa" w:w="40"/>
+                    <w:right w:type="dxa" w:w="60"/>
+                  </w:tcMar>
+                </w:tcPr>
+                <w:p>
+                  <w:r>
+                    <w:rPr>
+                      <w:rFonts w:ascii="Arial" w:cs="Arial" w:eastAsia="Arial" w:hAnsi="Arial"/>
+                      <w:b w:val="false"/>
+                      <w:bCs w:val="false"/>
+                      <w:sz w:val="16"/>
+                      <w:szCs w:val="16"/>
+                    </w:rPr>
+                    <w:t xml:space="preserve">Svaki član: objavljeni pregled svake dodjele</w:t>
+                  </w:r>
+                </w:p>
+              </w:tc>
+            </w:tr>
+            <w:tr>
+              <w:trPr>
+                <w:tblHeader w:val="off"/>
+              </w:trPr>
+              <w:tc>
+                <w:tcPr>
+                  <w:tcW w:type="dxa" w:w="1188"/>
+                  <w:tcMar>
+                    <w:top w:type="dxa" w:w="40"/>
+                    <w:left w:type="dxa" w:w="60"/>
+                    <w:bottom w:type="dxa" w:w="40"/>
+                    <w:right w:type="dxa" w:w="60"/>
+                  </w:tcMar>
+                </w:tcPr>
+                <w:p>
+                  <w:r>
+                    <w:rPr>
+                      <w:rFonts w:ascii="Arial" w:cs="Arial" w:eastAsia="Arial" w:hAnsi="Arial"/>
+                      <w:b w:val="false"/>
+                      <w:bCs w:val="false"/>
+                      <w:sz w:val="16"/>
+                      <w:szCs w:val="16"/>
+                    </w:rPr>
+                    <w:t xml:space="preserve">Operativni sastanak, sedmično pred događaj, inače mjesečno</w:t>
+                  </w:r>
+                </w:p>
+              </w:tc>
+              <w:tc>
+                <w:tcPr>
+                  <w:tcW w:type="dxa" w:w="1188"/>
+                  <w:tcMar>
+                    <w:top w:type="dxa" w:w="40"/>
+                    <w:left w:type="dxa" w:w="60"/>
+                    <w:bottom w:type="dxa" w:w="40"/>
+                    <w:right w:type="dxa" w:w="60"/>
+                  </w:tcMar>
+                </w:tcPr>
+                <w:p>
+                  <w:r>
+                    <w:rPr>
+                      <w:rFonts w:ascii="Arial" w:cs="Arial" w:eastAsia="Arial" w:hAnsi="Arial"/>
+                      <w:b w:val="false"/>
+                      <w:bCs w:val="false"/>
+                      <w:sz w:val="16"/>
+                      <w:szCs w:val="16"/>
+                    </w:rPr>
+                    <w:t xml:space="preserve">Izvršni direktor, rukovodioci timova, rukovodioci ogranaka, osoblje</w:t>
+                  </w:r>
+                </w:p>
+              </w:tc>
+              <w:tc>
+                <w:tcPr>
+                  <w:tcW w:type="dxa" w:w="1188"/>
+                  <w:tcMar>
+                    <w:top w:type="dxa" w:w="40"/>
+                    <w:left w:type="dxa" w:w="60"/>
+                    <w:bottom w:type="dxa" w:w="40"/>
+                    <w:right w:type="dxa" w:w="60"/>
+                  </w:tcMar>
+                </w:tcPr>
+                <w:p>
+                  <w:r>
+                    <w:rPr>
+                      <w:rFonts w:ascii="Arial" w:cs="Arial" w:eastAsia="Arial" w:hAnsi="Arial"/>
+                      <w:b w:val="false"/>
+                      <w:bCs w:val="false"/>
+                      <w:sz w:val="16"/>
+                      <w:szCs w:val="16"/>
+                    </w:rPr>
+                    <w:t xml:space="preserve">Svaki član koji ima zadatak za taj događaj</w:t>
+                  </w:r>
+                </w:p>
+              </w:tc>
+              <w:tc>
+                <w:tcPr>
+                  <w:tcW w:type="dxa" w:w="1188"/>
+                  <w:tcMar>
+                    <w:top w:type="dxa" w:w="40"/>
+                    <w:left w:type="dxa" w:w="60"/>
+                    <w:bottom w:type="dxa" w:w="40"/>
+                    <w:right w:type="dxa" w:w="60"/>
+                  </w:tcMar>
+                </w:tcPr>
+                <w:p>
+                  <w:r>
+                    <w:rPr>
+                      <w:rFonts w:ascii="Arial" w:cs="Arial" w:eastAsia="Arial" w:hAnsi="Arial"/>
+                      <w:b w:val="false"/>
+                      <w:bCs w:val="false"/>
+                      <w:sz w:val="16"/>
+                      <w:szCs w:val="16"/>
+                    </w:rPr>
+                    <w:t xml:space="preserve">Volonteri: brifing za događaj od svog rukovodioca sedmicu prije</w:t>
+                  </w:r>
+                </w:p>
+              </w:tc>
+            </w:tr>
+            <w:tr>
+              <w:trPr>
+                <w:tblHeader w:val="off"/>
+              </w:trPr>
+              <w:tc>
+                <w:tcPr>
+                  <w:tcW w:type="dxa" w:w="1188"/>
+                  <w:tcMar>
+                    <w:top w:type="dxa" w:w="40"/>
+                    <w:left w:type="dxa" w:w="60"/>
+                    <w:bottom w:type="dxa" w:w="40"/>
+                    <w:right w:type="dxa" w:w="60"/>
+                  </w:tcMar>
+                </w:tcPr>
+                <w:p>
+                  <w:r>
+                    <w:rPr>
+                      <w:rFonts w:ascii="Arial" w:cs="Arial" w:eastAsia="Arial" w:hAnsi="Arial"/>
+                      <w:b w:val="false"/>
+                      <w:bCs w:val="false"/>
+                      <w:sz w:val="16"/>
+                      <w:szCs w:val="16"/>
+                    </w:rPr>
+                    <w:t xml:space="preserve">Sastanak ogranka, najmanje deset dana prije Skupštine i prije svakog događaja ogranka</w:t>
+                  </w:r>
+                </w:p>
+              </w:tc>
+              <w:tc>
+                <w:tcPr>
+                  <w:tcW w:type="dxa" w:w="1188"/>
+                  <w:tcMar>
+                    <w:top w:type="dxa" w:w="40"/>
+                    <w:left w:type="dxa" w:w="60"/>
+                    <w:bottom w:type="dxa" w:w="40"/>
+                    <w:right w:type="dxa" w:w="60"/>
+                  </w:tcMar>
+                </w:tcPr>
+                <w:p>
+                  <w:r>
+                    <w:rPr>
+                      <w:rFonts w:ascii="Arial" w:cs="Arial" w:eastAsia="Arial" w:hAnsi="Arial"/>
+                      <w:b w:val="false"/>
+                      <w:bCs w:val="false"/>
+                      <w:sz w:val="16"/>
+                      <w:szCs w:val="16"/>
+                    </w:rPr>
+                    <w:t xml:space="preserve">Funkcioneri i članovi ogranka</w:t>
+                  </w:r>
+                </w:p>
+              </w:tc>
+              <w:tc>
+                <w:tcPr>
+                  <w:tcW w:type="dxa" w:w="1188"/>
+                  <w:tcMar>
+                    <w:top w:type="dxa" w:w="40"/>
+                    <w:left w:type="dxa" w:w="60"/>
+                    <w:bottom w:type="dxa" w:w="40"/>
+                    <w:right w:type="dxa" w:w="60"/>
+                  </w:tcMar>
+                </w:tcPr>
+                <w:p>
+                  <w:r>
+                    <w:rPr>
+                      <w:rFonts w:ascii="Arial" w:cs="Arial" w:eastAsia="Arial" w:hAnsi="Arial"/>
+                      <w:b w:val="false"/>
+                      <w:bCs w:val="false"/>
+                      <w:sz w:val="16"/>
+                      <w:szCs w:val="16"/>
+                    </w:rPr>
+                    <w:t xml:space="preserve">Izvršni direktor, po pozivu</w:t>
+                  </w:r>
+                </w:p>
+              </w:tc>
+              <w:tc>
+                <w:tcPr>
+                  <w:tcW w:type="dxa" w:w="1188"/>
+                  <w:tcMar>
+                    <w:top w:type="dxa" w:w="40"/>
+                    <w:left w:type="dxa" w:w="60"/>
+                    <w:bottom w:type="dxa" w:w="40"/>
+                    <w:right w:type="dxa" w:w="60"/>
+                  </w:tcMar>
+                </w:tcPr>
+                <w:p>
+                  <w:r>
+                    <w:rPr>
+                      <w:rFonts w:ascii="Arial" w:cs="Arial" w:eastAsia="Arial" w:hAnsi="Arial"/>
+                      <w:b w:val="false"/>
+                      <w:bCs w:val="false"/>
+                      <w:sz w:val="16"/>
+                      <w:szCs w:val="16"/>
+                    </w:rPr>
+                    <w:t xml:space="preserve">Upravni odbor: tromjesečni izvještaj rukovodioca ogranka</w:t>
+                  </w:r>
+                </w:p>
+              </w:tc>
+            </w:tr>
+          </w:tbl>
+          <w:p/>
+        </w:tc>
+        <w:tc>
+          <w:tcPr>
+            <w:tcW w:type="dxa" w:w="4953"/>
+            <w:tcMar>
+              <w:top w:type="dxa" w:w="80"/>
+              <w:left w:type="dxa" w:w="100"/>
+              <w:bottom w:type="dxa" w:w="80"/>
+              <w:right w:type="dxa" w:w="100"/>
+            </w:tcMar>
+          </w:tcPr>
+          <w:tbl>
+            <w:tblPr>
+              <w:tblW w:type="dxa" w:w="4753"/>
+              <w:tblBorders>
+                <w:top w:val="single" w:color="C9D3D7" w:sz="4"/>
+                <w:left w:val="single" w:color="C9D3D7" w:sz="4"/>
+                <w:bottom w:val="single" w:color="C9D3D7" w:sz="4"/>
+                <w:right w:val="single" w:color="C9D3D7" w:sz="4"/>
+                <w:insideH w:val="single" w:color="C9D3D7" w:sz="4"/>
+                <w:insideV w:val="single" w:color="C9D3D7" w:sz="4"/>
+              </w:tblBorders>
+            </w:tblPr>
+            <w:tblGrid>
+              <w:gridCol w:w="1188"/>
+              <w:gridCol w:w="1188"/>
+              <w:gridCol w:w="1188"/>
+              <w:gridCol w:w="1188"/>
+            </w:tblGrid>
+            <w:tr>
+              <w:trPr>
+                <w:tblHeader/>
+              </w:trPr>
+              <w:tc>
+                <w:tcPr>
+                  <w:tcW w:type="dxa" w:w="1188"/>
+                  <w:shd w:fill="E3EBED" w:color="auto" w:val="clear"/>
+                  <w:tcMar>
+                    <w:top w:type="dxa" w:w="40"/>
+                    <w:left w:type="dxa" w:w="60"/>
+                    <w:bottom w:type="dxa" w:w="40"/>
+                    <w:right w:type="dxa" w:w="60"/>
+                  </w:tcMar>
+                </w:tcPr>
+                <w:p>
+                  <w:r>
+                    <w:rPr>
+                      <w:rFonts w:ascii="Arial" w:cs="Arial" w:eastAsia="Arial" w:hAnsi="Arial"/>
+                      <w:b/>
+                      <w:bCs/>
+                      <w:sz w:val="16"/>
+                      <w:szCs w:val="16"/>
+                    </w:rPr>
+                    <w:t xml:space="preserve">Meeting or update</w:t>
+                  </w:r>
+                </w:p>
+              </w:tc>
+              <w:tc>
+                <w:tcPr>
+                  <w:tcW w:type="dxa" w:w="1188"/>
+                  <w:shd w:fill="E3EBED" w:color="auto" w:val="clear"/>
+                  <w:tcMar>
+                    <w:top w:type="dxa" w:w="40"/>
+                    <w:left w:type="dxa" w:w="60"/>
+                    <w:bottom w:type="dxa" w:w="40"/>
+                    <w:right w:type="dxa" w:w="60"/>
+                  </w:tcMar>
+                </w:tcPr>
+                <w:p>
+                  <w:r>
+                    <w:rPr>
+                      <w:rFonts w:ascii="Arial" w:cs="Arial" w:eastAsia="Arial" w:hAnsi="Arial"/>
+                      <w:b/>
+                      <w:bCs/>
+                      <w:sz w:val="16"/>
+                      <w:szCs w:val="16"/>
+                    </w:rPr>
+                    <w:t xml:space="preserve">Attends and decides</w:t>
+                  </w:r>
+                </w:p>
+              </w:tc>
+              <w:tc>
+                <w:tcPr>
+                  <w:tcW w:type="dxa" w:w="1188"/>
+                  <w:shd w:fill="E3EBED" w:color="auto" w:val="clear"/>
+                  <w:tcMar>
+                    <w:top w:type="dxa" w:w="40"/>
+                    <w:left w:type="dxa" w:w="60"/>
+                    <w:bottom w:type="dxa" w:w="40"/>
+                    <w:right w:type="dxa" w:w="60"/>
+                  </w:tcMar>
+                </w:tcPr>
+                <w:p>
+                  <w:r>
+                    <w:rPr>
+                      <w:rFonts w:ascii="Arial" w:cs="Arial" w:eastAsia="Arial" w:hAnsi="Arial"/>
+                      <w:b/>
+                      <w:bCs/>
+                      <w:sz w:val="16"/>
+                      <w:szCs w:val="16"/>
+                    </w:rPr>
+                    <w:t xml:space="preserve">Attends without a vote</w:t>
+                  </w:r>
+                </w:p>
+              </w:tc>
+              <w:tc>
+                <w:tcPr>
+                  <w:tcW w:type="dxa" w:w="1188"/>
+                  <w:shd w:fill="E3EBED" w:color="auto" w:val="clear"/>
+                  <w:tcMar>
+                    <w:top w:type="dxa" w:w="40"/>
+                    <w:left w:type="dxa" w:w="60"/>
+                    <w:bottom w:type="dxa" w:w="40"/>
+                    <w:right w:type="dxa" w:w="60"/>
+                  </w:tcMar>
+                </w:tcPr>
+                <w:p>
+                  <w:r>
+                    <w:rPr>
+                      <w:rFonts w:ascii="Arial" w:cs="Arial" w:eastAsia="Arial" w:hAnsi="Arial"/>
+                      <w:b/>
+                      <w:bCs/>
+                      <w:sz w:val="16"/>
+                      <w:szCs w:val="16"/>
+                    </w:rPr>
+                    <w:t xml:space="preserve">Receives the update only</w:t>
+                  </w:r>
+                </w:p>
+              </w:tc>
+            </w:tr>
+            <w:tr>
+              <w:trPr>
+                <w:tblHeader w:val="off"/>
+              </w:trPr>
+              <w:tc>
+                <w:tcPr>
+                  <w:tcW w:type="dxa" w:w="1188"/>
+                  <w:tcMar>
+                    <w:top w:type="dxa" w:w="40"/>
+                    <w:left w:type="dxa" w:w="60"/>
+                    <w:bottom w:type="dxa" w:w="40"/>
+                    <w:right w:type="dxa" w:w="60"/>
+                  </w:tcMar>
+                </w:tcPr>
+                <w:p>
+                  <w:r>
+                    <w:rPr>
+                      <w:rFonts w:ascii="Arial" w:cs="Arial" w:eastAsia="Arial" w:hAnsi="Arial"/>
+                      <w:b w:val="false"/>
+                      <w:bCs w:val="false"/>
+                      <w:sz w:val="16"/>
+                      <w:szCs w:val="16"/>
+                    </w:rPr>
+                    <w:t xml:space="preserve">Assembly, at least once a year</w:t>
+                  </w:r>
+                </w:p>
+              </w:tc>
+              <w:tc>
+                <w:tcPr>
+                  <w:tcW w:type="dxa" w:w="1188"/>
+                  <w:tcMar>
+                    <w:top w:type="dxa" w:w="40"/>
+                    <w:left w:type="dxa" w:w="60"/>
+                    <w:bottom w:type="dxa" w:w="40"/>
+                    <w:right w:type="dxa" w:w="60"/>
+                  </w:tcMar>
+                </w:tcPr>
+                <w:p>
+                  <w:r>
+                    <w:rPr>
+                      <w:rFonts w:ascii="Arial" w:cs="Arial" w:eastAsia="Arial" w:hAnsi="Arial"/>
+                      <w:b w:val="false"/>
+                      <w:bCs w:val="false"/>
+                      <w:sz w:val="16"/>
+                      <w:szCs w:val="16"/>
+                    </w:rPr>
+                    <w:t xml:space="preserve">Every member, founders included, in person or by proxy</w:t>
+                  </w:r>
+                </w:p>
+              </w:tc>
+              <w:tc>
+                <w:tcPr>
+                  <w:tcW w:type="dxa" w:w="1188"/>
+                  <w:tcMar>
+                    <w:top w:type="dxa" w:w="40"/>
+                    <w:left w:type="dxa" w:w="60"/>
+                    <w:bottom w:type="dxa" w:w="40"/>
+                    <w:right w:type="dxa" w:w="60"/>
+                  </w:tcMar>
+                </w:tcPr>
+                <w:p>
+                  <w:r>
+                    <w:rPr>
+                      <w:rFonts w:ascii="Arial" w:cs="Arial" w:eastAsia="Arial" w:hAnsi="Arial"/>
+                      <w:b w:val="false"/>
+                      <w:bCs w:val="false"/>
+                      <w:sz w:val="16"/>
+                      <w:szCs w:val="16"/>
+                    </w:rPr>
+                    <w:t xml:space="preserve">Volunteers who are not members, invited guests</w:t>
+                  </w:r>
+                </w:p>
+              </w:tc>
+              <w:tc>
+                <w:tcPr>
+                  <w:tcW w:type="dxa" w:w="1188"/>
+                  <w:tcMar>
+                    <w:top w:type="dxa" w:w="40"/>
+                    <w:left w:type="dxa" w:w="60"/>
+                    <w:bottom w:type="dxa" w:w="40"/>
+                    <w:right w:type="dxa" w:w="60"/>
+                  </w:tcMar>
+                </w:tcPr>
+                <w:p>
+                  <w:r>
+                    <w:rPr>
+                      <w:rFonts w:ascii="Arial" w:cs="Arial" w:eastAsia="Arial" w:hAnsi="Arial"/>
+                      <w:b w:val="false"/>
+                      <w:bCs w:val="false"/>
+                      <w:sz w:val="16"/>
+                      <w:szCs w:val="16"/>
+                    </w:rPr>
+                    <w:t xml:space="preserve">Donors, sponsors and partners get the annual report and the Impact Day invitation</w:t>
+                  </w:r>
+                </w:p>
+              </w:tc>
+            </w:tr>
+            <w:tr>
+              <w:trPr>
+                <w:tblHeader w:val="off"/>
+              </w:trPr>
+              <w:tc>
+                <w:tcPr>
+                  <w:tcW w:type="dxa" w:w="1188"/>
+                  <w:tcMar>
+                    <w:top w:type="dxa" w:w="40"/>
+                    <w:left w:type="dxa" w:w="60"/>
+                    <w:bottom w:type="dxa" w:w="40"/>
+                    <w:right w:type="dxa" w:w="60"/>
+                  </w:tcMar>
+                </w:tcPr>
+                <w:p>
+                  <w:r>
+                    <w:rPr>
+                      <w:rFonts w:ascii="Arial" w:cs="Arial" w:eastAsia="Arial" w:hAnsi="Arial"/>
+                      <w:b w:val="false"/>
+                      <w:bCs w:val="false"/>
+                      <w:sz w:val="16"/>
+                      <w:szCs w:val="16"/>
+                    </w:rPr>
+                    <w:t xml:space="preserve">Board, four meetings a year</w:t>
+                  </w:r>
+                </w:p>
+              </w:tc>
+              <w:tc>
+                <w:tcPr>
+                  <w:tcW w:type="dxa" w:w="1188"/>
+                  <w:tcMar>
+                    <w:top w:type="dxa" w:w="40"/>
+                    <w:left w:type="dxa" w:w="60"/>
+                    <w:bottom w:type="dxa" w:w="40"/>
+                    <w:right w:type="dxa" w:w="60"/>
+                  </w:tcMar>
+                </w:tcPr>
+                <w:p>
+                  <w:r>
+                    <w:rPr>
+                      <w:rFonts w:ascii="Arial" w:cs="Arial" w:eastAsia="Arial" w:hAnsi="Arial"/>
+                      <w:b w:val="false"/>
+                      <w:bCs w:val="false"/>
+                      <w:sz w:val="16"/>
+                      <w:szCs w:val="16"/>
+                    </w:rPr>
+                    <w:t xml:space="preserve">Board members</w:t>
+                  </w:r>
+                </w:p>
+              </w:tc>
+              <w:tc>
+                <w:tcPr>
+                  <w:tcW w:type="dxa" w:w="1188"/>
+                  <w:tcMar>
+                    <w:top w:type="dxa" w:w="40"/>
+                    <w:left w:type="dxa" w:w="60"/>
+                    <w:bottom w:type="dxa" w:w="40"/>
+                    <w:right w:type="dxa" w:w="60"/>
+                  </w:tcMar>
+                </w:tcPr>
+                <w:p>
+                  <w:r>
+                    <w:rPr>
+                      <w:rFonts w:ascii="Arial" w:cs="Arial" w:eastAsia="Arial" w:hAnsi="Arial"/>
+                      <w:b w:val="false"/>
+                      <w:bCs w:val="false"/>
+                      <w:sz w:val="16"/>
+                      <w:szCs w:val="16"/>
+                    </w:rPr>
+                    <w:t xml:space="preserve">The Executive Director; a team lead or chapter lead for their item, on invitation</w:t>
+                  </w:r>
+                </w:p>
+              </w:tc>
+              <w:tc>
+                <w:tcPr>
+                  <w:tcW w:type="dxa" w:w="1188"/>
+                  <w:tcMar>
+                    <w:top w:type="dxa" w:w="40"/>
+                    <w:left w:type="dxa" w:w="60"/>
+                    <w:bottom w:type="dxa" w:w="40"/>
+                    <w:right w:type="dxa" w:w="60"/>
+                  </w:tcMar>
+                </w:tcPr>
+                <w:p>
+                  <w:r>
+                    <w:rPr>
+                      <w:rFonts w:ascii="Arial" w:cs="Arial" w:eastAsia="Arial" w:hAnsi="Arial"/>
+                      <w:b w:val="false"/>
+                      <w:bCs w:val="false"/>
+                      <w:sz w:val="16"/>
+                      <w:szCs w:val="16"/>
+                    </w:rPr>
+                    <w:t xml:space="preserve">Every member: a short note of the decisions after each meeting</w:t>
+                  </w:r>
+                </w:p>
+              </w:tc>
+            </w:tr>
+            <w:tr>
+              <w:trPr>
+                <w:tblHeader w:val="off"/>
+              </w:trPr>
+              <w:tc>
+                <w:tcPr>
+                  <w:tcW w:type="dxa" w:w="1188"/>
+                  <w:tcMar>
+                    <w:top w:type="dxa" w:w="40"/>
+                    <w:left w:type="dxa" w:w="60"/>
+                    <w:bottom w:type="dxa" w:w="40"/>
+                    <w:right w:type="dxa" w:w="60"/>
+                  </w:tcMar>
+                </w:tcPr>
+                <w:p>
+                  <w:r>
+                    <w:rPr>
+                      <w:rFonts w:ascii="Arial" w:cs="Arial" w:eastAsia="Arial" w:hAnsi="Arial"/>
+                      <w:b w:val="false"/>
+                      <w:bCs w:val="false"/>
+                      <w:sz w:val="16"/>
+                      <w:szCs w:val="16"/>
+                    </w:rPr>
+                    <w:t xml:space="preserve">Grants Committee, four sittings a year</w:t>
+                  </w:r>
+                </w:p>
+              </w:tc>
+              <w:tc>
+                <w:tcPr>
+                  <w:tcW w:type="dxa" w:w="1188"/>
+                  <w:tcMar>
+                    <w:top w:type="dxa" w:w="40"/>
+                    <w:left w:type="dxa" w:w="60"/>
+                    <w:bottom w:type="dxa" w:w="40"/>
+                    <w:right w:type="dxa" w:w="60"/>
+                  </w:tcMar>
+                </w:tcPr>
+                <w:p>
+                  <w:r>
+                    <w:rPr>
+                      <w:rFonts w:ascii="Arial" w:cs="Arial" w:eastAsia="Arial" w:hAnsi="Arial"/>
+                      <w:b w:val="false"/>
+                      <w:bCs w:val="false"/>
+                      <w:sz w:val="16"/>
+                      <w:szCs w:val="16"/>
+                    </w:rPr>
+                    <w:t xml:space="preserve">Committee members</w:t>
+                  </w:r>
+                </w:p>
+              </w:tc>
+              <w:tc>
+                <w:tcPr>
+                  <w:tcW w:type="dxa" w:w="1188"/>
+                  <w:tcMar>
+                    <w:top w:type="dxa" w:w="40"/>
+                    <w:left w:type="dxa" w:w="60"/>
+                    <w:bottom w:type="dxa" w:w="40"/>
+                    <w:right w:type="dxa" w:w="60"/>
+                  </w:tcMar>
+                </w:tcPr>
+                <w:p>
+                  <w:r>
+                    <w:rPr>
+                      <w:rFonts w:ascii="Arial" w:cs="Arial" w:eastAsia="Arial" w:hAnsi="Arial"/>
+                      <w:b w:val="false"/>
+                      <w:bCs w:val="false"/>
+                      <w:sz w:val="16"/>
+                      <w:szCs w:val="16"/>
+                    </w:rPr>
+                    <w:t xml:space="preserve">The Executive Director for the record and the implementation; an applicant when heard</w:t>
+                  </w:r>
+                </w:p>
+              </w:tc>
+              <w:tc>
+                <w:tcPr>
+                  <w:tcW w:type="dxa" w:w="1188"/>
+                  <w:tcMar>
+                    <w:top w:type="dxa" w:w="40"/>
+                    <w:left w:type="dxa" w:w="60"/>
+                    <w:bottom w:type="dxa" w:w="40"/>
+                    <w:right w:type="dxa" w:w="60"/>
+                  </w:tcMar>
+                </w:tcPr>
+                <w:p>
+                  <w:r>
+                    <w:rPr>
+                      <w:rFonts w:ascii="Arial" w:cs="Arial" w:eastAsia="Arial" w:hAnsi="Arial"/>
+                      <w:b w:val="false"/>
+                      <w:bCs w:val="false"/>
+                      <w:sz w:val="16"/>
+                      <w:szCs w:val="16"/>
+                    </w:rPr>
+                    <w:t xml:space="preserve">Every member: the published summary of each allocation</w:t>
+                  </w:r>
+                </w:p>
+              </w:tc>
+            </w:tr>
+            <w:tr>
+              <w:trPr>
+                <w:tblHeader w:val="off"/>
+              </w:trPr>
+              <w:tc>
+                <w:tcPr>
+                  <w:tcW w:type="dxa" w:w="1188"/>
+                  <w:tcMar>
+                    <w:top w:type="dxa" w:w="40"/>
+                    <w:left w:type="dxa" w:w="60"/>
+                    <w:bottom w:type="dxa" w:w="40"/>
+                    <w:right w:type="dxa" w:w="60"/>
+                  </w:tcMar>
+                </w:tcPr>
+                <w:p>
+                  <w:r>
+                    <w:rPr>
+                      <w:rFonts w:ascii="Arial" w:cs="Arial" w:eastAsia="Arial" w:hAnsi="Arial"/>
+                      <w:b w:val="false"/>
+                      <w:bCs w:val="false"/>
+                      <w:sz w:val="16"/>
+                      <w:szCs w:val="16"/>
+                    </w:rPr>
+                    <w:t xml:space="preserve">Operations meeting, weekly in the run-up to an event, monthly otherwise</w:t>
+                  </w:r>
+                </w:p>
+              </w:tc>
+              <w:tc>
+                <w:tcPr>
+                  <w:tcW w:type="dxa" w:w="1188"/>
+                  <w:tcMar>
+                    <w:top w:type="dxa" w:w="40"/>
+                    <w:left w:type="dxa" w:w="60"/>
+                    <w:bottom w:type="dxa" w:w="40"/>
+                    <w:right w:type="dxa" w:w="60"/>
+                  </w:tcMar>
+                </w:tcPr>
+                <w:p>
+                  <w:r>
+                    <w:rPr>
+                      <w:rFonts w:ascii="Arial" w:cs="Arial" w:eastAsia="Arial" w:hAnsi="Arial"/>
+                      <w:b w:val="false"/>
+                      <w:bCs w:val="false"/>
+                      <w:sz w:val="16"/>
+                      <w:szCs w:val="16"/>
+                    </w:rPr>
+                    <w:t xml:space="preserve">The Executive Director, team leads, chapter leads, staff</w:t>
+                  </w:r>
+                </w:p>
+              </w:tc>
+              <w:tc>
+                <w:tcPr>
+                  <w:tcW w:type="dxa" w:w="1188"/>
+                  <w:tcMar>
+                    <w:top w:type="dxa" w:w="40"/>
+                    <w:left w:type="dxa" w:w="60"/>
+                    <w:bottom w:type="dxa" w:w="40"/>
+                    <w:right w:type="dxa" w:w="60"/>
+                  </w:tcMar>
+                </w:tcPr>
+                <w:p>
+                  <w:r>
+                    <w:rPr>
+                      <w:rFonts w:ascii="Arial" w:cs="Arial" w:eastAsia="Arial" w:hAnsi="Arial"/>
+                      <w:b w:val="false"/>
+                      <w:bCs w:val="false"/>
+                      <w:sz w:val="16"/>
+                      <w:szCs w:val="16"/>
+                    </w:rPr>
+                    <w:t xml:space="preserve">Any member who holds a task for that event</w:t>
+                  </w:r>
+                </w:p>
+              </w:tc>
+              <w:tc>
+                <w:tcPr>
+                  <w:tcW w:type="dxa" w:w="1188"/>
+                  <w:tcMar>
+                    <w:top w:type="dxa" w:w="40"/>
+                    <w:left w:type="dxa" w:w="60"/>
+                    <w:bottom w:type="dxa" w:w="40"/>
+                    <w:right w:type="dxa" w:w="60"/>
+                  </w:tcMar>
+                </w:tcPr>
+                <w:p>
+                  <w:r>
+                    <w:rPr>
+                      <w:rFonts w:ascii="Arial" w:cs="Arial" w:eastAsia="Arial" w:hAnsi="Arial"/>
+                      <w:b w:val="false"/>
+                      <w:bCs w:val="false"/>
+                      <w:sz w:val="16"/>
+                      <w:szCs w:val="16"/>
+                    </w:rPr>
+                    <w:t xml:space="preserve">Volunteers: the event briefing from their lead the week before</w:t>
+                  </w:r>
+                </w:p>
+              </w:tc>
+            </w:tr>
+            <w:tr>
+              <w:trPr>
+                <w:tblHeader w:val="off"/>
+              </w:trPr>
+              <w:tc>
+                <w:tcPr>
+                  <w:tcW w:type="dxa" w:w="1188"/>
+                  <w:tcMar>
+                    <w:top w:type="dxa" w:w="40"/>
+                    <w:left w:type="dxa" w:w="60"/>
+                    <w:bottom w:type="dxa" w:w="40"/>
+                    <w:right w:type="dxa" w:w="60"/>
+                  </w:tcMar>
+                </w:tcPr>
+                <w:p>
+                  <w:r>
+                    <w:rPr>
+                      <w:rFonts w:ascii="Arial" w:cs="Arial" w:eastAsia="Arial" w:hAnsi="Arial"/>
+                      <w:b w:val="false"/>
+                      <w:bCs w:val="false"/>
+                      <w:sz w:val="16"/>
+                      <w:szCs w:val="16"/>
+                    </w:rPr>
+                    <w:t xml:space="preserve">Chapter meeting, at least ten days before an Assembly and before each chapter event</w:t>
+                  </w:r>
+                </w:p>
+              </w:tc>
+              <w:tc>
+                <w:tcPr>
+                  <w:tcW w:type="dxa" w:w="1188"/>
+                  <w:tcMar>
+                    <w:top w:type="dxa" w:w="40"/>
+                    <w:left w:type="dxa" w:w="60"/>
+                    <w:bottom w:type="dxa" w:w="40"/>
+                    <w:right w:type="dxa" w:w="60"/>
+                  </w:tcMar>
+                </w:tcPr>
+                <w:p>
+                  <w:r>
+                    <w:rPr>
+                      <w:rFonts w:ascii="Arial" w:cs="Arial" w:eastAsia="Arial" w:hAnsi="Arial"/>
+                      <w:b w:val="false"/>
+                      <w:bCs w:val="false"/>
+                      <w:sz w:val="16"/>
+                      <w:szCs w:val="16"/>
+                    </w:rPr>
+                    <w:t xml:space="preserve">The chapter's officers and members</w:t>
+                  </w:r>
+                </w:p>
+              </w:tc>
+              <w:tc>
+                <w:tcPr>
+                  <w:tcW w:type="dxa" w:w="1188"/>
+                  <w:tcMar>
+                    <w:top w:type="dxa" w:w="40"/>
+                    <w:left w:type="dxa" w:w="60"/>
+                    <w:bottom w:type="dxa" w:w="40"/>
+                    <w:right w:type="dxa" w:w="60"/>
+                  </w:tcMar>
+                </w:tcPr>
+                <w:p>
+                  <w:r>
+                    <w:rPr>
+                      <w:rFonts w:ascii="Arial" w:cs="Arial" w:eastAsia="Arial" w:hAnsi="Arial"/>
+                      <w:b w:val="false"/>
+                      <w:bCs w:val="false"/>
+                      <w:sz w:val="16"/>
+                      <w:szCs w:val="16"/>
+                    </w:rPr>
+                    <w:t xml:space="preserve">The Executive Director, on invitation</w:t>
+                  </w:r>
+                </w:p>
+              </w:tc>
+              <w:tc>
+                <w:tcPr>
+                  <w:tcW w:type="dxa" w:w="1188"/>
+                  <w:tcMar>
+                    <w:top w:type="dxa" w:w="40"/>
+                    <w:left w:type="dxa" w:w="60"/>
+                    <w:bottom w:type="dxa" w:w="40"/>
+                    <w:right w:type="dxa" w:w="60"/>
+                  </w:tcMar>
+                </w:tcPr>
+                <w:p>
+                  <w:r>
+                    <w:rPr>
+                      <w:rFonts w:ascii="Arial" w:cs="Arial" w:eastAsia="Arial" w:hAnsi="Arial"/>
+                      <w:b w:val="false"/>
+                      <w:bCs w:val="false"/>
+                      <w:sz w:val="16"/>
+                      <w:szCs w:val="16"/>
+                    </w:rPr>
+                    <w:t xml:space="preserve">The Board: the chapter lead's quarterly report</w:t>
+                  </w:r>
+                </w:p>
+              </w:tc>
+            </w:tr>
+          </w:tbl>
+          <w:p/>
+        </w:tc>
+      </w:tr>
+      <w:tr>
+        <w:tc>
+          <w:tcPr>
+            <w:tcW w:type="dxa" w:w="4953"/>
+            <w:tcMar>
+              <w:top w:type="dxa" w:w="80"/>
+              <w:left w:type="dxa" w:w="100"/>
+              <w:bottom w:type="dxa" w:w="80"/>
+              <w:right w:type="dxa" w:w="100"/>
+            </w:tcMar>
+          </w:tcPr>
+          <w:p>
+            <w:pPr>
+              <w:spacing w:after="100"/>
+            </w:pPr>
+            <w:r>
+              <w:rPr>
+                <w:rFonts w:ascii="Arial" w:cs="Arial" w:eastAsia="Arial" w:hAnsi="Arial"/>
+                <w:sz w:val="18"/>
+                <w:szCs w:val="18"/>
+              </w:rPr>
+              <w:t xml:space="preserve">Član koji nema ulogu prisustvuje Skupštini i dobija obavještenje poslije svake sjednice Upravnog odbora, plan za godinu, rezultate svakog događaja i poziv na svaku Skupštinu. Volonter koji nije član dobija brifinge za događaje na kojima radi i poziv da se učlani.</w:t>
+            </w:r>
+          </w:p>
+        </w:tc>
+        <w:tc>
+          <w:tcPr>
+            <w:tcW w:type="dxa" w:w="4953"/>
+            <w:tcMar>
+              <w:top w:type="dxa" w:w="80"/>
+              <w:left w:type="dxa" w:w="100"/>
+              <w:bottom w:type="dxa" w:w="80"/>
+              <w:right w:type="dxa" w:w="100"/>
+            </w:tcMar>
+          </w:tcPr>
+          <w:p>
+            <w:pPr>
+              <w:spacing w:after="100"/>
+            </w:pPr>
+            <w:r>
+              <w:rPr>
+                <w:rFonts w:ascii="Arial" w:cs="Arial" w:eastAsia="Arial" w:hAnsi="Arial"/>
+                <w:sz w:val="18"/>
+                <w:szCs w:val="18"/>
+              </w:rPr>
+              <w:t xml:space="preserve">A member who holds no role attends the Assembly and receives the update after every Board meeting, the plan for the year, the results of every event and the invitation to each Assembly. A volunteer who is not a member receives the briefings for the events they work and the invitation to join.</w:t>
+            </w:r>
+          </w:p>
+        </w:tc>
+      </w:tr>
+      <w:tr>
+        <w:tc>
+          <w:tcPr>
+            <w:tcW w:type="dxa" w:w="4953"/>
+            <w:shd w:fill="F1F5F6" w:color="auto" w:val="clear"/>
+            <w:tcMar>
+              <w:top w:type="dxa" w:w="80"/>
+              <w:left w:type="dxa" w:w="100"/>
+              <w:bottom w:type="dxa" w:w="80"/>
+              <w:right w:type="dxa" w:w="100"/>
+            </w:tcMar>
+          </w:tcPr>
+          <w:p>
+            <w:r>
+              <w:rPr>
+                <w:rFonts w:ascii="Arial" w:cs="Arial" w:eastAsia="Arial" w:hAnsi="Arial"/>
+                <w:b/>
+                <w:bCs/>
+                <w:color w:val="0E3A46"/>
+                <w:sz w:val="20"/>
+                <w:szCs w:val="20"/>
+              </w:rPr>
+              <w:t xml:space="preserve">Član 15 — Kako se preuzima uloga</w:t>
+            </w:r>
+          </w:p>
+        </w:tc>
+        <w:tc>
+          <w:tcPr>
+            <w:tcW w:type="dxa" w:w="4953"/>
+            <w:shd w:fill="F1F5F6" w:color="auto" w:val="clear"/>
+            <w:tcMar>
+              <w:top w:type="dxa" w:w="80"/>
+              <w:left w:type="dxa" w:w="100"/>
+              <w:bottom w:type="dxa" w:w="80"/>
+              <w:right w:type="dxa" w:w="100"/>
+            </w:tcMar>
+          </w:tcPr>
+          <w:p>
+            <w:r>
+              <w:rPr>
+                <w:rFonts w:ascii="Arial" w:cs="Arial" w:eastAsia="Arial" w:hAnsi="Arial"/>
+                <w:b/>
+                <w:bCs/>
+                <w:color w:val="0E3A46"/>
+                <w:sz w:val="20"/>
+                <w:szCs w:val="20"/>
+              </w:rPr>
+              <w:t xml:space="preserve">Article 15 — How a role is taken up</w:t>
             </w:r>
           </w:p>
         </w:tc>
@@ -8418,7 +9806,7 @@
                 <w:sz w:val="20"/>
                 <w:szCs w:val="20"/>
               </w:rPr>
-              <w:t xml:space="preserve">Član 15 — Kako se postaje član</w:t>
+              <w:t xml:space="preserve">Član 16 — Kako se postaje član</w:t>
             </w:r>
           </w:p>
         </w:tc>
@@ -8443,7 +9831,7 @@
                 <w:sz w:val="20"/>
                 <w:szCs w:val="20"/>
               </w:rPr>
-              <w:t xml:space="preserve">Article 15 — Becoming a member</w:t>
+              <w:t xml:space="preserve">Article 16 — Becoming a member</w:t>
             </w:r>
           </w:p>
         </w:tc>
@@ -8570,7 +9958,7 @@
                 <w:sz w:val="20"/>
                 <w:szCs w:val="20"/>
               </w:rPr>
-              <w:t xml:space="preserve">Član 16 — Prava i obaveze</w:t>
+              <w:t xml:space="preserve">Član 17 — Prava i obaveze</w:t>
             </w:r>
           </w:p>
         </w:tc>
@@ -8595,7 +9983,7 @@
                 <w:sz w:val="20"/>
                 <w:szCs w:val="20"/>
               </w:rPr>
-              <w:t xml:space="preserve">Article 16 — Rights and duties</w:t>
+              <w:t xml:space="preserve">Article 17 — Rights and duties</w:t>
             </w:r>
           </w:p>
         </w:tc>
@@ -9094,7 +10482,7 @@
                 <w:sz w:val="20"/>
                 <w:szCs w:val="20"/>
               </w:rPr>
-              <w:t xml:space="preserve">Član 17 — Članarina</w:t>
+              <w:t xml:space="preserve">Član 18 — Članarina</w:t>
             </w:r>
           </w:p>
         </w:tc>
@@ -9119,7 +10507,7 @@
                 <w:sz w:val="20"/>
                 <w:szCs w:val="20"/>
               </w:rPr>
-              <w:t xml:space="preserve">Article 17 — Membership fee</w:t>
+              <w:t xml:space="preserve">Article 18 — Membership fee</w:t>
             </w:r>
           </w:p>
         </w:tc>
@@ -9195,7 +10583,7 @@
                 <w:sz w:val="18"/>
                 <w:szCs w:val="18"/>
               </w:rPr>
-              <w:t xml:space="preserve">Za 2027. godinu Upravni odbor predlaže Skupštini, do [[PLACEHOLDER: mjesec predloga]], da li se članarina naplaćuje i u kom iznosu, zajedno sa spiskom pogodnosti iz člana 18. Skupština odlučuje svake godine; može odlučiti da se članarina ne naplaćuje.</w:t>
+              <w:t xml:space="preserve">Za 2027. godinu Upravni odbor predlaže Skupštini, do [[PLACEHOLDER: mjesec predloga]], da li se članarina naplaćuje i u kom iznosu, zajedno sa spiskom pogodnosti iz člana 19. Skupština odlučuje svake godine; može odlučiti da se članarina ne naplaćuje.</w:t>
             </w:r>
           </w:p>
         </w:tc>
@@ -9219,7 +10607,7 @@
                 <w:sz w:val="18"/>
                 <w:szCs w:val="18"/>
               </w:rPr>
-              <w:t xml:space="preserve">For 2027 the Board proposes to the Assembly, by [[PLACEHOLDER: month of the proposal]], whether a fee is charged and in what amount, together with the list of benefits in Article 18. The Assembly decides every year; it may decide that no fee is charged.</w:t>
+              <w:t xml:space="preserve">For 2027 the Board proposes to the Assembly, by [[PLACEHOLDER: month of the proposal]], whether a fee is charged and in what amount, together with the list of benefits in Article 19. The Assembly decides every year; it may decide that no fee is charged.</w:t>
             </w:r>
           </w:p>
         </w:tc>
@@ -9246,7 +10634,7 @@
                 <w:sz w:val="20"/>
                 <w:szCs w:val="20"/>
               </w:rPr>
-              <w:t xml:space="preserve">Član 18 — Šta članstvo donosi</w:t>
+              <w:t xml:space="preserve">Član 19 — Šta članstvo donosi</w:t>
             </w:r>
           </w:p>
         </w:tc>
@@ -9271,7 +10659,7 @@
                 <w:sz w:val="20"/>
                 <w:szCs w:val="20"/>
               </w:rPr>
-              <w:t xml:space="preserve">Article 18 — What membership brings</w:t>
+              <w:t xml:space="preserve">Article 19 — What membership brings</w:t>
             </w:r>
           </w:p>
         </w:tc>
@@ -9626,7 +11014,7 @@
                 <w:sz w:val="20"/>
                 <w:szCs w:val="20"/>
               </w:rPr>
-              <w:t xml:space="preserve">Član 19 — Pristup dokumentima</w:t>
+              <w:t xml:space="preserve">Član 20 — Pristup dokumentima</w:t>
             </w:r>
           </w:p>
         </w:tc>
@@ -9651,7 +11039,7 @@
                 <w:sz w:val="20"/>
                 <w:szCs w:val="20"/>
               </w:rPr>
-              <w:t xml:space="preserve">Article 19 — Access to documents</w:t>
+              <w:t xml:space="preserve">Article 20 — Access to documents</w:t>
             </w:r>
           </w:p>
         </w:tc>
@@ -9728,7 +11116,7 @@
                 <w:sz w:val="20"/>
                 <w:szCs w:val="20"/>
               </w:rPr>
-              <w:t xml:space="preserve">Član 20 — Izmjene</w:t>
+              <w:t xml:space="preserve">Član 21 — Izmjene</w:t>
             </w:r>
           </w:p>
         </w:tc>
@@ -9753,7 +11141,7 @@
                 <w:sz w:val="20"/>
                 <w:szCs w:val="20"/>
               </w:rPr>
-              <w:t xml:space="preserve">Article 20 — Changes</w:t>
+              <w:t xml:space="preserve">Article 21 — Changes</w:t>
             </w:r>
           </w:p>
         </w:tc>

</xml_diff>

<commit_message>
feat(console): the org chart as the founders drew it; meetings column, search and year filter
The chart puts the Board, the Executive Director and the Grants Committee
in one row under the Assembly, the Board governing the Director from the
left and the Committee's decisions reaching the Director from the right;
the Assembly's President is named by office in the Assembly box. The
organisation document names the first Director and the Assembly's President
and deputy from the founding minutes.

Documents › Organisation and rules shows the five latest meetings in a
right-hand column; the meetings page takes a search word (title, agenda or
minutes) and a year.

Co-Authored-By: Claude Fable 5.1 <noreply@anthropic.com>
Claude-Session: https://claude.ai/code/session_01AVM926ubKsaqkthGFjJRy4
</commit_message>
<xml_diff>
--- a/docs/legal/dist/organisation-and-roles.docx
+++ b/docs/legal/dist/organisation-and-roles.docx
@@ -565,7 +565,7 @@
                 <w:sz w:val="18"/>
                 <w:szCs w:val="18"/>
               </w:rPr>
-              <w:t xml:space="preserve">Skupština je najviši organ. Čine je svi članovi, svaki sa jednim glasom, i sastaje se najmanje jednom godišnje. Član koji ne može prisustvovati može dati pisano punomoćje drugom članu.</w:t>
+              <w:t xml:space="preserve">Skupština je najviši organ. Čine je svi članovi, svaki sa jednim glasom, i sastaje se najmanje jednom godišnje. Član koji ne može prisustvovati može dati pisano punomoćje drugom članu. Skupština iz reda članova bira Predsjednika i zamjenika Predsjednika; Predsjednik saziva sjednice i rukovodi njima, provjerava punomoćja i kvorum i ima odlučujući glas kada je glasanje dva puta neriješeno.</w:t>
             </w:r>
           </w:p>
         </w:tc>
@@ -589,7 +589,7 @@
                 <w:sz w:val="18"/>
                 <w:szCs w:val="18"/>
               </w:rPr>
-              <w:t xml:space="preserve">The Assembly is the highest body. It consists of all members, each with one vote, and meets at least once a year. A member who cannot attend may give a written proxy to another member.</w:t>
+              <w:t xml:space="preserve">The Assembly is the highest body. It consists of all members, each with one vote, and meets at least once a year. A member who cannot attend may give a written proxy to another member. The Assembly elects its President and deputy President from among the members; the President convenes and chairs the sessions, verifies proxies and the quorum, and has the casting vote when a vote is tied twice.</w:t>
             </w:r>
           </w:p>
         </w:tc>
@@ -1493,7 +1493,7 @@
                 <w:sz w:val="18"/>
                 <w:szCs w:val="18"/>
               </w:rPr>
-              <w:t xml:space="preserve">Prvi Izvršni direktor je osnivač Santamorea, [[PLACEHOLDER: ime osnivača kojeg bira osnivačka skupština]], kojeg bira osnivačka skupština. Mandat traje šest godina, sa ponovnim izborom bez ograničenja, kako bilježi zapisnik osnivačke skupštine, a prijevremeno razrješenje moguće je samo iz razloga navedenog u Statutu, dvotrećinskom većinom svih članova (izmjene usvojene 21. 10. 2026, odjeljak 6 dopuna statuta).</w:t>
+              <w:t xml:space="preserve">Prvi Izvršni direktor je osnivač Santamorea, Tseggai Debrezion, kojeg je osnivačka skupština izabrala 26. 9. 2026, kada je izabran i za Predsjednika Skupštine, a Dragana Durica za zamjenika Predsjednika. Mandat traje šest godina, sa ponovnim izborom bez ograničenja, kako bilježi zapisnik osnivačke skupštine, a prijevremeno razrješenje moguće je samo iz razloga navedenog u Statutu, dvotrećinskom većinom svih članova (izmjene usvojene 21. 10. 2026, odjeljak 6 dopuna statuta).</w:t>
             </w:r>
           </w:p>
         </w:tc>
@@ -1517,7 +1517,7 @@
                 <w:sz w:val="18"/>
                 <w:szCs w:val="18"/>
               </w:rPr>
-              <w:t xml:space="preserve">The first Executive Director is the founder of Santamore, [[PLACEHOLDER: name of the founder elected by the founding assembly]], elected by the founding assembly. The term is six years, renewable without limit, as the founding minutes record, and early dismissal is possible only for a reason stated in the Statute, by a two-thirds majority of all members (amendments adopted on 21 October 2026, section 6 of the statute additions).</w:t>
+              <w:t xml:space="preserve">The first Executive Director is the founder of Santamore, Tseggai Debrezion, elected by the founding assembly on 26 September 2026, which also elected him President of the Assembly and Dragana Durica deputy President. The term is six years, renewable without limit, as the founding minutes record, and early dismissal is possible only for a reason stated in the Statute, by a two-thirds majority of all members (amendments adopted on 21 October 2026, section 6 of the statute additions).</w:t>
             </w:r>
           </w:p>
         </w:tc>

</xml_diff>